<commit_message>
Actualizacion lun. 28/09/2026 11:31:52,24
</commit_message>
<xml_diff>
--- a/documentacion/estado_de_caja_formulas.docx
+++ b/documentacion/estado_de_caja_formulas.docx
@@ -642,7 +642,7 @@
         <w:spacing w:after="160"/>
       </w:pPr>
       <w:r>
-        <w:t xml:space="preserve">Son los movimientos de tipo "Cheque", concepto "Cartera", sin diferido y TODAVÍA SIN EFECTIVIZAR (efectivizacion vacía) de esa caja puntual. Representan cheques que la empresa tiene en la mano pero todavía no cobró/depositó. Como no tienen diferido, técnicamente ya cuentan como "firmes" — por eso el sistema los separa en su propio renglón y los excluye del renglón de "Movimientos", para no sumarlos dos veces (ver sección 5).</w:t>
+        <w:t xml:space="preserve">Son los movimientos de tipo "Cheque", concepto "Cartera", sin diferido y TODAVÍA SIN EFECTIVIZAR (efectivizacion vacía) de esa caja puntual. NO son cheques que la empresa recibió: son cheques que Fontana tiene preparados para ENTREGARLE a un productor, y que todavía no se le dieron. Por eso el monto se carga en positivo al principio (como cualquier pago que sale) — pero mientras el cheque sigue "en cartera" (sin entregar), esa plata en los hechos sigue siendo de la empresa.</w:t>
       </w:r>
     </w:p>
     <w:tbl>
@@ -805,6 +805,165 @@
         </w:tc>
       </w:tr>
     </w:tbl>
+    <w:tbl>
+      <w:tblPr>
+        <w:tblW w:type="dxa" w:w="9360"/>
+        <w:tblBorders>
+          <w:top w:val="single" w:color="E8C468" w:sz="4"/>
+          <w:left w:val="single" w:color="E8C468" w:sz="4"/>
+          <w:bottom w:val="single" w:color="E8C468" w:sz="4"/>
+          <w:right w:val="single" w:color="E8C468" w:sz="4"/>
+          <w:insideH w:val="single" w:color="auto" w:sz="4"/>
+          <w:insideV w:val="single" w:color="auto" w:sz="4"/>
+        </w:tblBorders>
+      </w:tblPr>
+      <w:tblGrid>
+        <w:gridCol w:w="9360"/>
+      </w:tblGrid>
+      <w:tr>
+        <w:tc>
+          <w:tcPr>
+            <w:tcW w:type="dxa" w:w="9360"/>
+            <w:shd w:fill="FFF4D6" w:color="auto" w:val="clear"/>
+            <w:tcMar>
+              <w:top w:type="dxa" w:w="140"/>
+              <w:left w:type="dxa" w:w="200"/>
+              <w:bottom w:type="dxa" w:w="140"/>
+              <w:right w:type="dxa" w:w="200"/>
+            </w:tcMar>
+          </w:tcPr>
+          <w:p>
+            <w:pPr>
+              <w:spacing w:after="80"/>
+            </w:pPr>
+            <w:r>
+              <w:rPr>
+                <w:b/>
+                <w:bCs/>
+              </w:rPr>
+              <w:t xml:space="preserve">Corrección 28/09/2026 — el signo de la cartera pendiente</w:t>
+            </w:r>
+          </w:p>
+          <w:p>
+            <w:pPr>
+              <w:spacing w:after="60"/>
+            </w:pPr>
+            <w:r>
+              <w:t xml:space="preserve">Mientras un cheque sigue en cartera (sin diferido, sin efectivizar) cuenta A FAVOR nuestro: se RESTA del saldo, no se suma — aunque su monto esté guardado en positivo. En palabras de Gastón: "esos cheques al no tener aún diferido, estar en cartera y no tener efectivización es como que aún no se entregaron a productores, así que debería ser a favor nuestro hasta que se entreguen".</w:t>
+            </w:r>
+          </w:p>
+          <w:p>
+            <w:pPr>
+              <w:spacing w:after="60"/>
+            </w:pPr>
+            <w:r>
+              <w:t xml:space="preserve">Apenas el cheque tiene una fecha de diferido (se programa la entrega) o se efectiviza (se entrega/cobra), deja de estar "en cartera" y pasa a contarse en el renglón de "Movimientos" con su monto guardado SIN invertir — recién ahí es una deuda real. El dato guardado en la base nunca cambia; sólo cambia, según el estado del cheque, si se lo suma o se lo resta al armar el saldo.</w:t>
+            </w:r>
+          </w:p>
+        </w:tc>
+      </w:tr>
+    </w:tbl>
+    <w:p>
+      <w:pPr>
+        <w:spacing w:after="160"/>
+      </w:pPr>
+      <w:r>
+        <w:t xml:space="preserve">Función: </w:t>
+      </w:r>
+      <w:r>
+        <w:rPr>
+          <w:rFonts w:ascii="Consolas" w:cs="Consolas" w:eastAsia="Consolas" w:hAnsi="Consolas"/>
+          <w:b/>
+          <w:bCs/>
+        </w:rPr>
+        <w:t xml:space="preserve">_cheques_en_cartera(caja)</w:t>
+      </w:r>
+      <w:r>
+        <w:t xml:space="preserve"> devuelve la suma YA con este ajuste aplicado (el total negado), lista para sumarse tal cual al saldo:</w:t>
+      </w:r>
+    </w:p>
+    <w:tbl>
+      <w:tblPr>
+        <w:tblW w:type="dxa" w:w="9360"/>
+        <w:tblBorders>
+          <w:top w:val="single" w:color="CCCCCC" w:sz="4"/>
+          <w:left w:val="single" w:color="CCCCCC" w:sz="4"/>
+          <w:bottom w:val="single" w:color="CCCCCC" w:sz="4"/>
+          <w:right w:val="single" w:color="CCCCCC" w:sz="4"/>
+          <w:insideH w:val="single" w:color="auto" w:sz="4"/>
+          <w:insideV w:val="single" w:color="auto" w:sz="4"/>
+        </w:tblBorders>
+      </w:tblPr>
+      <w:tblGrid>
+        <w:gridCol w:w="9360"/>
+      </w:tblGrid>
+      <w:tr>
+        <w:tc>
+          <w:tcPr>
+            <w:tcW w:type="dxa" w:w="9360"/>
+            <w:shd w:fill="F2F2F2" w:color="auto" w:val="clear"/>
+            <w:tcMar>
+              <w:top w:type="dxa" w:w="120"/>
+              <w:left w:type="dxa" w:w="160"/>
+              <w:bottom w:type="dxa" w:w="120"/>
+              <w:right w:type="dxa" w:w="160"/>
+            </w:tcMar>
+          </w:tcPr>
+          <w:p>
+            <w:pPr>
+              <w:spacing w:after="0"/>
+            </w:pPr>
+            <w:r>
+              <w:rPr>
+                <w:rFonts w:ascii="Consolas" w:cs="Consolas" w:eastAsia="Consolas" w:hAnsi="Consolas"/>
+                <w:sz w:val="18"/>
+                <w:szCs w:val="18"/>
+              </w:rPr>
+              <w:t xml:space="preserve">def _cheques_en_cartera(caja):</w:t>
+            </w:r>
+          </w:p>
+          <w:p>
+            <w:pPr>
+              <w:spacing w:after="0"/>
+            </w:pPr>
+            <w:r>
+              <w:rPr>
+                <w:rFonts w:ascii="Consolas" w:cs="Consolas" w:eastAsia="Consolas" w:hAnsi="Consolas"/>
+                <w:sz w:val="18"/>
+                <w:szCs w:val="18"/>
+              </w:rPr>
+              <w:t xml:space="preserve">    total = _cheques_en_cartera_qs(caja)\</w:t>
+            </w:r>
+          </w:p>
+          <w:p>
+            <w:pPr>
+              <w:spacing w:after="0"/>
+            </w:pPr>
+            <w:r>
+              <w:rPr>
+                <w:rFonts w:ascii="Consolas" w:cs="Consolas" w:eastAsia="Consolas" w:hAnsi="Consolas"/>
+                <w:sz w:val="18"/>
+                <w:szCs w:val="18"/>
+              </w:rPr>
+              <w:t xml:space="preserve">        .aggregate(total=Sum('monto'))['total'] or Decimal('0')</w:t>
+            </w:r>
+          </w:p>
+          <w:p>
+            <w:pPr>
+              <w:spacing w:after="0"/>
+            </w:pPr>
+            <w:r>
+              <w:rPr>
+                <w:rFonts w:ascii="Consolas" w:cs="Consolas" w:eastAsia="Consolas" w:hAnsi="Consolas"/>
+                <w:sz w:val="18"/>
+                <w:szCs w:val="18"/>
+              </w:rPr>
+              <w:t xml:space="preserve">    return -total   # a favor nuestro mientras sigue sin entregar</w:t>
+            </w:r>
+          </w:p>
+        </w:tc>
+      </w:tr>
+    </w:tbl>
     <w:p>
       <w:pPr>
         <w:pStyle w:val="Heading1"/>
@@ -819,7 +978,7 @@
         <w:spacing w:after="160"/>
       </w:pPr>
       <w:r>
-        <w:t xml:space="preserve">Función: _calcular_estado_caja(caja, fecha). No distingue cartera de otros movimientos — simplemente suma TODO lo firme.</w:t>
+        <w:t xml:space="preserve">Función: _calcular_estado_caja(caja, fecha). Usa los mismos dos bloques que "Calcular por defecto" (sección 5) — movimientos firmes sin la cartera pendiente, más la cartera pendiente ya con su signo corregido — así que las dos pantallas siempre dan el mismo total para la misma caja.</w:t>
       </w:r>
     </w:p>
     <w:tbl>
@@ -862,7 +1021,39 @@
                 <w:sz w:val="22"/>
                 <w:szCs w:val="22"/>
               </w:rPr>
-              <w:t xml:space="preserve">saldo_a_fecha  =  saldo_inicial(primer_libro)  +  Σ montos de _movimientos_firmes_de_caja</w:t>
+              <w:t xml:space="preserve">saldo_a_fecha  =  saldo_inicial(primer_libro)</w:t>
+            </w:r>
+          </w:p>
+          <w:p>
+            <w:pPr>
+              <w:spacing w:after="60"/>
+            </w:pPr>
+            <w:r>
+              <w:rPr>
+                <w:rFonts w:ascii="Consolas" w:cs="Consolas" w:eastAsia="Consolas" w:hAnsi="Consolas"/>
+                <w:b/>
+                <w:bCs/>
+                <w:color w:val="1F4E5F"/>
+                <w:sz w:val="22"/>
+                <w:szCs w:val="22"/>
+              </w:rPr>
+              <w:t xml:space="preserve">                +  _movimientos_firmes_excluyendo_cartera(caja, fecha)</w:t>
+            </w:r>
+          </w:p>
+          <w:p>
+            <w:pPr>
+              <w:spacing w:after="60"/>
+            </w:pPr>
+            <w:r>
+              <w:rPr>
+                <w:rFonts w:ascii="Consolas" w:cs="Consolas" w:eastAsia="Consolas" w:hAnsi="Consolas"/>
+                <w:b/>
+                <w:bCs/>
+                <w:color w:val="1F4E5F"/>
+                <w:sz w:val="22"/>
+                <w:szCs w:val="22"/>
+              </w:rPr>
+              <w:t xml:space="preserve">                +  _cheques_en_cartera(caja)          &lt;-- ya viene negado</w:t>
             </w:r>
           </w:p>
         </w:tc>
@@ -931,20 +1122,20 @@
                 <w:sz w:val="18"/>
                 <w:szCs w:val="18"/>
               </w:rPr>
-              <w:t xml:space="preserve">total_firme = _movimientos_firmes_de_caja(caja, fecha)\</w:t>
-            </w:r>
-          </w:p>
-          <w:p>
-            <w:pPr>
-              <w:spacing w:after="0"/>
-            </w:pPr>
-            <w:r>
-              <w:rPr>
-                <w:rFonts w:ascii="Consolas" w:cs="Consolas" w:eastAsia="Consolas" w:hAnsi="Consolas"/>
-                <w:sz w:val="18"/>
-                <w:szCs w:val="18"/>
-              </w:rPr>
-              <w:t xml:space="preserve">    .aggregate(total=Sum('monto'))['total'] or Decimal('0')</w:t>
+              <w:t xml:space="preserve">total_firme = _movimientos_firmes_excluyendo_cartera(caja, fecha) \</w:t>
+            </w:r>
+          </w:p>
+          <w:p>
+            <w:pPr>
+              <w:spacing w:after="0"/>
+            </w:pPr>
+            <w:r>
+              <w:rPr>
+                <w:rFonts w:ascii="Consolas" w:cs="Consolas" w:eastAsia="Consolas" w:hAnsi="Consolas"/>
+                <w:sz w:val="18"/>
+                <w:szCs w:val="18"/>
+              </w:rPr>
+              <w:t xml:space="preserve">    + _cheques_en_cartera(caja)</w:t>
             </w:r>
           </w:p>
           <w:p>
@@ -1100,7 +1291,7 @@
                 <w:sz w:val="22"/>
                 <w:szCs w:val="22"/>
               </w:rPr>
-              <w:t xml:space="preserve">   monto  = _cheques_en_cartera(caja)</w:t>
+              <w:t xml:space="preserve">   monto  = _cheques_en_cartera(caja)          &lt;-- negativo mientras está pendiente</w:t>
             </w:r>
           </w:p>
           <w:p>
@@ -1811,7 +2002,7 @@
                 <w:sz w:val="19"/>
                 <w:szCs w:val="19"/>
               </w:rPr>
-              <w:t xml:space="preserve">Renglón 2 — Cheques en cartera (sin cobrar)</w:t>
+              <w:t xml:space="preserve">Renglón 2 — Cheques en cartera (sin entregar)</w:t>
             </w:r>
           </w:p>
         </w:tc>
@@ -1862,7 +2053,7 @@
         <w:spacing w:after="160"/>
       </w:pPr>
       <w:r>
-        <w:t xml:space="preserve">El "saldo_final" (-19.000.000,00 en este ejemplo) es lo que se muestra como "Saldo actual" en pantalla. Ya tiene sumados, una sola vez cada uno: el saldo de origen, todos los movimientos firmes, y la cartera pendiente.</w:t>
+        <w:t xml:space="preserve">El "saldo_final" (-19.000.000,00 en este ejemplo) es lo que se muestra como "Saldo actual" en pantalla. Ya tiene sumados, una sola vez cada uno: el saldo de origen, todos los movimientos firmes, y la cartera pendiente (con su signo ya corregido a favor nuestro — el -800.000,00 del Renglón 2 es justamente lo que devuelve _cheques_en_cartera, no el monto crudo guardado en la base).</w:t>
       </w:r>
     </w:p>
     <w:p>
@@ -2274,7 +2465,7 @@
                 <w:sz w:val="19"/>
                 <w:szCs w:val="19"/>
               </w:rPr>
-              <w:t xml:space="preserve">Cheques recibidos, todavía sin cobrar, de esa caja</w:t>
+              <w:t xml:space="preserve">Cheques para entregar a un productor, todavía sin entregar; el segundo ya devuelve el total con el signo a favor nuestro</w:t>
             </w:r>
           </w:p>
         </w:tc>

</xml_diff>

<commit_message>
Actualizacion lun. 28/09/2026 13:18:12,86
</commit_message>
<xml_diff>
--- a/documentacion/estado_de_caja_formulas.docx
+++ b/documentacion/estado_de_caja_formulas.docx
@@ -42,7 +42,7 @@
           <w:sz w:val="20"/>
           <w:szCs w:val="20"/>
         </w:rPr>
-        <w:t xml:space="preserve">Rediseño del 28/09/2026 — documento de referencia técnica</w:t>
+        <w:t xml:space="preserve">Rediseño del 28/09/2026, corregido el 29/09/2026 — documento de referencia técnica</w:t>
       </w:r>
     </w:p>
     <w:p>
@@ -760,6 +760,19 @@
                 <w:sz w:val="18"/>
                 <w:szCs w:val="18"/>
               </w:rPr>
+              <w:t xml:space="preserve">            asiento_libro__isnull=False,   # agregado 29/09/2026, ver nota abajo</w:t>
+            </w:r>
+          </w:p>
+          <w:p>
+            <w:pPr>
+              <w:spacing w:after="0"/>
+            </w:pPr>
+            <w:r>
+              <w:rPr>
+                <w:rFonts w:ascii="Consolas" w:cs="Consolas" w:eastAsia="Consolas" w:hAnsi="Consolas"/>
+                <w:sz w:val="18"/>
+                <w:szCs w:val="18"/>
+              </w:rPr>
               <w:t xml:space="preserve">        )</w:t>
             </w:r>
           </w:p>
@@ -800,6 +813,72 @@
                 <w:szCs w:val="18"/>
               </w:rPr>
               <w:t xml:space="preserve">    )</w:t>
+            </w:r>
+          </w:p>
+        </w:tc>
+      </w:tr>
+    </w:tbl>
+    <w:p>
+      <w:pPr>
+        <w:spacing w:after="160"/>
+      </w:pPr>
+      <w:r>
+        <w:t xml:space="preserve">El filtro asiento_libro__isnull=False (mismo requisito que _movimientos_firmes_de_caja, sección 3.2) se agregó el 29/09/2026 para blindar un caso borde: un cheque en cartera que TODAVÍA no tiene libro asignado no debe restarse acá, porque tampoco está sumado en "Movimientos" (esos movimientos "sin libro" se avisan aparte, nunca se suman). Sin este filtro se lo restaría sin haberlo sumado antes — el mismo tipo de error que motivó todo este rediseño, aplicado a ese caso puntual.</w:t>
+      </w:r>
+    </w:p>
+    <w:tbl>
+      <w:tblPr>
+        <w:tblW w:type="dxa" w:w="9360"/>
+        <w:tblBorders>
+          <w:top w:val="single" w:color="E8C468" w:sz="4"/>
+          <w:left w:val="single" w:color="E8C468" w:sz="4"/>
+          <w:bottom w:val="single" w:color="E8C468" w:sz="4"/>
+          <w:right w:val="single" w:color="E8C468" w:sz="4"/>
+          <w:insideH w:val="single" w:color="auto" w:sz="4"/>
+          <w:insideV w:val="single" w:color="auto" w:sz="4"/>
+        </w:tblBorders>
+      </w:tblPr>
+      <w:tblGrid>
+        <w:gridCol w:w="9360"/>
+      </w:tblGrid>
+      <w:tr>
+        <w:tc>
+          <w:tcPr>
+            <w:tcW w:type="dxa" w:w="9360"/>
+            <w:shd w:fill="FFF4D6" w:color="auto" w:val="clear"/>
+            <w:tcMar>
+              <w:top w:type="dxa" w:w="140"/>
+              <w:left w:type="dxa" w:w="200"/>
+              <w:bottom w:type="dxa" w:w="140"/>
+              <w:right w:type="dxa" w:w="200"/>
+            </w:tcMar>
+          </w:tcPr>
+          <w:p>
+            <w:pPr>
+              <w:spacing w:after="80"/>
+            </w:pPr>
+            <w:r>
+              <w:rPr>
+                <w:b/>
+                <w:bCs/>
+              </w:rPr>
+              <w:t xml:space="preserve">Corrección 28/09/2026 — el signo de la cartera pendiente</w:t>
+            </w:r>
+          </w:p>
+          <w:p>
+            <w:pPr>
+              <w:spacing w:after="60"/>
+            </w:pPr>
+            <w:r>
+              <w:t xml:space="preserve">Mientras un cheque sigue en cartera (sin diferido, sin efectivizar) cuenta A FAVOR nuestro. En palabras de Gastón: "esos cheques al no tener aún diferido, estar en cartera y no tener efectivización es como que aún no se entregaron a productores, así que debería ser a favor nuestro hasta que se entreguen".</w:t>
+            </w:r>
+          </w:p>
+          <w:p>
+            <w:pPr>
+              <w:spacing w:after="60"/>
+            </w:pPr>
+            <w:r>
+              <w:t xml:space="preserve">Apenas el cheque tiene una fecha de diferido (se programa la entrega) o se efectiviza (se entrega/cobra), deja de estar "en cartera" — recién ahí es una deuda real, sin ningún ajuste. El dato guardado en la base nunca cambia; sólo cambia, según el estado del cheque, si se lo neutraliza o no al armar el saldo (ver la corrección del 29/09/2026, más abajo).</w:t>
             </w:r>
           </w:p>
         </w:tc>
@@ -841,7 +920,7 @@
                 <w:b/>
                 <w:bCs/>
               </w:rPr>
-              <w:t xml:space="preserve">Corrección 28/09/2026 — el signo de la cartera pendiente</w:t>
+              <w:t xml:space="preserve">Corrección 29/09/2026 — dejar de EXCLUIR la cartera y pasar a NEUTRALIZARLA</w:t>
             </w:r>
           </w:p>
           <w:p>
@@ -849,7 +928,7 @@
               <w:spacing w:after="60"/>
             </w:pPr>
             <w:r>
-              <w:t xml:space="preserve">Mientras un cheque sigue en cartera (sin diferido, sin efectivizar) cuenta A FAVOR nuestro: se RESTA del saldo, no se suma — aunque su monto esté guardado en positivo. En palabras de Gastón: "esos cheques al no tener aún diferido, estar en cartera y no tener efectivización es como que aún no se entregaron a productores, así que debería ser a favor nuestro hasta que se entreguen".</w:t>
+              <w:t xml:space="preserve">La primera versión de esta corrección (28/09) sacaba estos cheques del total de "Movimientos" (sección 3.2) Y ADEMÁS los restaba acá — eso los beneficiaba DOS VECES: una por no contarlos como el débito que en los hechos representan, y otra por restarlos aparte como si fueran un crédito real. Gastón lo detectó así: "si no contás los en cartera en los movimientos para descontar el saldo inicial y luego lo volvés a poner a favor nuestro [...] es como que está dos veces beneficiándonos ese valor [...] ideal creo sería contar todo en movimientos y sólo beneficiarlos sumando eso en cartera después a favor nuestro".</w:t>
             </w:r>
           </w:p>
           <w:p>
@@ -857,7 +936,7 @@
               <w:spacing w:after="60"/>
             </w:pPr>
             <w:r>
-              <w:t xml:space="preserve">Apenas el cheque tiene una fecha de diferido (se programa la entrega) o se efectiviza (se entrega/cobra), deja de estar "en cartera" y pasa a contarse en el renglón de "Movimientos" con su monto guardado SIN invertir — recién ahí es una deuda real. El dato guardado en la base nunca cambia; sólo cambia, según el estado del cheque, si se lo suma o se lo resta al armar el saldo.</w:t>
+              <w:t xml:space="preserve">La corrección: desde el 29/09/2026, el total de "Movimientos" (ver sección 3.2, ahora _total_movimientos_firmes) SIEMPRE incluye estos cheques, con su monto guardado en positivo, como cualquier otro firme. Acá, _cheques_en_cartera pasa de ser "el total de la cartera con el signo que va al saldo" a ser una CORRECCIÓN que resta esa misma cantidad para neutralizar lo que "Movimientos" ya sumó. El efecto neto de un cheque en cartera pendiente pasa a ser CERO (ni suma ni resta) en vez de un crédito de más — recién cuando se entrega o efectiviza deja de neutralizarse y queda contando la deuda real, que ya estaba sumada desde el principio.</w:t>
             </w:r>
           </w:p>
         </w:tc>
@@ -879,7 +958,7 @@
         <w:t xml:space="preserve">_cheques_en_cartera(caja)</w:t>
       </w:r>
       <w:r>
-        <w:t xml:space="preserve"> devuelve la suma YA con este ajuste aplicado (el total negado), lista para sumarse tal cual al saldo:</w:t>
+        <w:t xml:space="preserve"> — el código no cambió (sigue devolviendo el total negado), sólo cambió lo que ese valor SIGNIFICA: ya no es "la cartera con su signo final", es la corrección que neutraliza lo que la sección 3.2 ya contó:</w:t>
       </w:r>
     </w:p>
     <w:tbl>
@@ -958,7 +1037,7 @@
                 <w:sz w:val="18"/>
                 <w:szCs w:val="18"/>
               </w:rPr>
-              <w:t xml:space="preserve">    return -total   # a favor nuestro mientras sigue sin entregar</w:t>
+              <w:t xml:space="preserve">    return -total   # neutraliza, mientras sigue pendiente, lo ya sumado en "Movimientos"</w:t>
             </w:r>
           </w:p>
         </w:tc>
@@ -978,7 +1057,7 @@
         <w:spacing w:after="160"/>
       </w:pPr>
       <w:r>
-        <w:t xml:space="preserve">Función: _calcular_estado_caja(caja, fecha). Usa los mismos dos bloques que "Calcular por defecto" (sección 5) — movimientos firmes sin la cartera pendiente, más la cartera pendiente ya con su signo corregido — así que las dos pantallas siempre dan el mismo total para la misma caja.</w:t>
+        <w:t xml:space="preserve">Función: _calcular_estado_caja(caja, fecha). Usa los mismos dos bloques que "Calcular por defecto" (sección 5) — TODOS los movimientos firmes (cartera pendiente incluida con su monto guardado), más la corrección que neutraliza esa misma cartera mientras sigue pendiente — así que las dos pantallas siempre dan el mismo total para la misma caja.</w:t>
       </w:r>
     </w:p>
     <w:tbl>
@@ -1037,7 +1116,7 @@
                 <w:sz w:val="22"/>
                 <w:szCs w:val="22"/>
               </w:rPr>
-              <w:t xml:space="preserve">                +  _movimientos_firmes_excluyendo_cartera(caja, fecha)</w:t>
+              <w:t xml:space="preserve">                +  _total_movimientos_firmes(caja, fecha)      &lt;-- cartera incluida</w:t>
             </w:r>
           </w:p>
           <w:p>
@@ -1053,7 +1132,7 @@
                 <w:sz w:val="22"/>
                 <w:szCs w:val="22"/>
               </w:rPr>
-              <w:t xml:space="preserve">                +  _cheques_en_cartera(caja)          &lt;-- ya viene negado</w:t>
+              <w:t xml:space="preserve">                +  _cheques_en_cartera(caja)                   &lt;-- la neutraliza</w:t>
             </w:r>
           </w:p>
         </w:tc>
@@ -1122,7 +1201,7 @@
                 <w:sz w:val="18"/>
                 <w:szCs w:val="18"/>
               </w:rPr>
-              <w:t xml:space="preserve">total_firme = _movimientos_firmes_excluyendo_cartera(caja, fecha) \</w:t>
+              <w:t xml:space="preserve">total_firme = _total_movimientos_firmes(caja, fecha) \</w:t>
             </w:r>
           </w:p>
           <w:p>
@@ -1227,7 +1306,7 @@
                 <w:sz w:val="22"/>
                 <w:szCs w:val="22"/>
               </w:rPr>
-              <w:t xml:space="preserve">   monto  = _movimientos_firmes_excluyendo_cartera(caja, fecha)</w:t>
+              <w:t xml:space="preserve">   monto  = _total_movimientos_firmes(caja, fecha)      &lt;-- cartera pendiente incluida</w:t>
             </w:r>
           </w:p>
           <w:p>
@@ -1291,7 +1370,7 @@
                 <w:sz w:val="22"/>
                 <w:szCs w:val="22"/>
               </w:rPr>
-              <w:t xml:space="preserve">   monto  = _cheques_en_cartera(caja)          &lt;-- negativo mientras está pendiente</w:t>
+              <w:t xml:space="preserve">   monto  = _cheques_en_cartera(caja)     &lt;-- neutraliza el mismo monto del Renglón 1</w:t>
             </w:r>
           </w:p>
           <w:p>
@@ -1318,7 +1397,7 @@
         <w:spacing w:after="160"/>
       </w:pPr>
       <w:r>
-        <w:t xml:space="preserve">_movimientos_firmes_excluyendo_cartera es igual a _movimientos_firmes_de_caja, pero descartando los ids que ya aparecen en _cheques_en_cartera_qs (para no sumarlos dos veces: un cheque en cartera no tiene diferido, así que sin este descarte contaría como "firme" en el Renglón 1 Y de nuevo en el Renglón 2).</w:t>
+        <w:t xml:space="preserve">_total_movimientos_firmes es simplemente la suma de _movimientos_firmes_de_caja — ya NO descarta los cheques en cartera (hasta el 28/09/2026 se llamaba _movimientos_firmes_excluyendo_cartera y sí los descartaba; ver la nota de la sección 3.3 sobre por qué eso beneficiaba dos veces a esos cheques).</w:t>
       </w:r>
     </w:p>
     <w:tbl>
@@ -1358,98 +1437,33 @@
                 <w:sz w:val="18"/>
                 <w:szCs w:val="18"/>
               </w:rPr>
-              <w:t xml:space="preserve">def _movimientos_firmes_excluyendo_cartera(caja, fecha):</w:t>
-            </w:r>
-          </w:p>
-          <w:p>
-            <w:pPr>
-              <w:spacing w:after="0"/>
-            </w:pPr>
-            <w:r>
-              <w:rPr>
-                <w:rFonts w:ascii="Consolas" w:cs="Consolas" w:eastAsia="Consolas" w:hAnsi="Consolas"/>
-                <w:sz w:val="18"/>
-                <w:szCs w:val="18"/>
-              </w:rPr>
-              <w:t xml:space="preserve">    ids_cartera = set(_cheques_en_cartera_qs(caja).values_list('id', flat=True))</w:t>
-            </w:r>
-          </w:p>
-          <w:p>
-            <w:pPr>
-              <w:spacing w:after="0"/>
-            </w:pPr>
-            <w:r>
-              <w:rPr>
-                <w:rFonts w:ascii="Consolas" w:cs="Consolas" w:eastAsia="Consolas" w:hAnsi="Consolas"/>
-                <w:sz w:val="18"/>
-                <w:szCs w:val="18"/>
-              </w:rPr>
-              <w:t xml:space="preserve">    total = Decimal('0')</w:t>
-            </w:r>
-          </w:p>
-          <w:p>
-            <w:pPr>
-              <w:spacing w:after="0"/>
-            </w:pPr>
-            <w:r>
-              <w:rPr>
-                <w:rFonts w:ascii="Consolas" w:cs="Consolas" w:eastAsia="Consolas" w:hAnsi="Consolas"/>
-                <w:sz w:val="18"/>
-                <w:szCs w:val="18"/>
-              </w:rPr>
-              <w:t xml:space="preserve">    for monto, mov_id in _movimientos_firmes_de_caja(caja, fecha)\</w:t>
-            </w:r>
-          </w:p>
-          <w:p>
-            <w:pPr>
-              <w:spacing w:after="0"/>
-            </w:pPr>
-            <w:r>
-              <w:rPr>
-                <w:rFonts w:ascii="Consolas" w:cs="Consolas" w:eastAsia="Consolas" w:hAnsi="Consolas"/>
-                <w:sz w:val="18"/>
-                <w:szCs w:val="18"/>
-              </w:rPr>
-              <w:t xml:space="preserve">            .values_list('monto', 'id'):</w:t>
-            </w:r>
-          </w:p>
-          <w:p>
-            <w:pPr>
-              <w:spacing w:after="0"/>
-            </w:pPr>
-            <w:r>
-              <w:rPr>
-                <w:rFonts w:ascii="Consolas" w:cs="Consolas" w:eastAsia="Consolas" w:hAnsi="Consolas"/>
-                <w:sz w:val="18"/>
-                <w:szCs w:val="18"/>
-              </w:rPr>
-              <w:t xml:space="preserve">        if mov_id not in ids_cartera:</w:t>
-            </w:r>
-          </w:p>
-          <w:p>
-            <w:pPr>
-              <w:spacing w:after="0"/>
-            </w:pPr>
-            <w:r>
-              <w:rPr>
-                <w:rFonts w:ascii="Consolas" w:cs="Consolas" w:eastAsia="Consolas" w:hAnsi="Consolas"/>
-                <w:sz w:val="18"/>
-                <w:szCs w:val="18"/>
-              </w:rPr>
-              <w:t xml:space="preserve">            total += monto</w:t>
-            </w:r>
-          </w:p>
-          <w:p>
-            <w:pPr>
-              <w:spacing w:after="0"/>
-            </w:pPr>
-            <w:r>
-              <w:rPr>
-                <w:rFonts w:ascii="Consolas" w:cs="Consolas" w:eastAsia="Consolas" w:hAnsi="Consolas"/>
-                <w:sz w:val="18"/>
-                <w:szCs w:val="18"/>
-              </w:rPr>
-              <w:t xml:space="preserve">    return total</w:t>
+              <w:t xml:space="preserve">def _total_movimientos_firmes(caja, fecha):</w:t>
+            </w:r>
+          </w:p>
+          <w:p>
+            <w:pPr>
+              <w:spacing w:after="0"/>
+            </w:pPr>
+            <w:r>
+              <w:rPr>
+                <w:rFonts w:ascii="Consolas" w:cs="Consolas" w:eastAsia="Consolas" w:hAnsi="Consolas"/>
+                <w:sz w:val="18"/>
+                <w:szCs w:val="18"/>
+              </w:rPr>
+              <w:t xml:space="preserve">    return _movimientos_firmes_de_caja(caja, fecha)\</w:t>
+            </w:r>
+          </w:p>
+          <w:p>
+            <w:pPr>
+              <w:spacing w:after="0"/>
+            </w:pPr>
+            <w:r>
+              <w:rPr>
+                <w:rFonts w:ascii="Consolas" w:cs="Consolas" w:eastAsia="Consolas" w:hAnsi="Consolas"/>
+                <w:sz w:val="18"/>
+                <w:szCs w:val="18"/>
+              </w:rPr>
+              <w:t xml:space="preserve">        .aggregate(total=Sum('monto'))['total'] or Decimal('0')</w:t>
             </w:r>
           </w:p>
           <w:p>
@@ -1514,7 +1528,7 @@
                 <w:sz w:val="18"/>
                 <w:szCs w:val="18"/>
               </w:rPr>
-              <w:t xml:space="preserve">    movimientos_firmes = _movimientos_firmes_excluyendo_cartera(caja, fecha)</w:t>
+              <w:t xml:space="preserve">    movimientos_firmes = _total_movimientos_firmes(caja, fecha)</w:t>
             </w:r>
           </w:p>
           <w:p>
@@ -1577,7 +1591,7 @@
         <w:spacing w:after="160"/>
       </w:pPr>
       <w:r>
-        <w:t xml:space="preserve">El "Saldo actual" grande que se ve arriba de cada tarjeta (Macro / Nación) en la pantalla es exactamente ese saldo_final — es decir, YA incluye la cartera sumada una vez (ver la sección 8, tu pregunta puntual).</w:t>
+        <w:t xml:space="preserve">El "Saldo actual" grande que se ve arriba de cada tarjeta (Macro / Nación) en la pantalla es exactamente ese saldo_final — es decir, YA tiene la cartera pendiente sumada y neutralizada una sola vez cada cosa (ver la sección 8, tu pregunta puntual).</w:t>
       </w:r>
     </w:p>
     <w:p>
@@ -1764,7 +1778,7 @@
         <w:spacing w:after="160"/>
       </w:pPr>
       <w:r>
-        <w:t xml:space="preserve">Con números simples, para seguir el cálculo paso a paso (no son tus datos reales, es sólo para mostrar cómo encajan las piezas):</w:t>
+        <w:t xml:space="preserve">Con números simples, para seguir el cálculo paso a paso (no son tus datos reales, es sólo para mostrar cómo encajan las piezas). Hay un cheque en cartera pendiente por 800.000,00 (todavía sin entregar) mezclado con el resto de los movimientos firmes de -3.200.000,00:</w:t>
       </w:r>
     </w:p>
     <w:tbl>
@@ -1940,7 +1954,7 @@
                 <w:sz w:val="19"/>
                 <w:szCs w:val="19"/>
               </w:rPr>
-              <w:t xml:space="preserve">Renglón 1 — Movimientos (todos los libros, sin cartera)</w:t>
+              <w:t xml:space="preserve">Renglón 1 — Movimientos (todos los libros: -3.200.000,00 del resto + 800.000,00 del cheque en cartera)</w:t>
             </w:r>
           </w:p>
         </w:tc>
@@ -1960,7 +1974,7 @@
                 <w:sz w:val="19"/>
                 <w:szCs w:val="19"/>
               </w:rPr>
-              <w:t xml:space="preserve">-3.200.000,00</w:t>
+              <w:t xml:space="preserve">-2.400.000,00</w:t>
             </w:r>
           </w:p>
         </w:tc>
@@ -1980,7 +1994,7 @@
                 <w:sz w:val="19"/>
                 <w:szCs w:val="19"/>
               </w:rPr>
-              <w:t xml:space="preserve">-18.200.000,00</w:t>
+              <w:t xml:space="preserve">-17.400.000,00</w:t>
             </w:r>
           </w:p>
         </w:tc>
@@ -2002,7 +2016,7 @@
                 <w:sz w:val="19"/>
                 <w:szCs w:val="19"/>
               </w:rPr>
-              <w:t xml:space="preserve">Renglón 2 — Cheques en cartera (sin entregar)</w:t>
+              <w:t xml:space="preserve">Renglón 2 — Cheques en cartera (neutraliza el 800.000,00 del Renglón 1, sigue sin entregar)</w:t>
             </w:r>
           </w:p>
         </w:tc>
@@ -2042,7 +2056,7 @@
                 <w:sz w:val="19"/>
                 <w:szCs w:val="19"/>
               </w:rPr>
-              <w:t xml:space="preserve">-19.000.000,00  ← saldo_final</w:t>
+              <w:t xml:space="preserve">-18.200.000,00  ← saldo_final</w:t>
             </w:r>
           </w:p>
         </w:tc>
@@ -2053,7 +2067,7 @@
         <w:spacing w:after="160"/>
       </w:pPr>
       <w:r>
-        <w:t xml:space="preserve">El "saldo_final" (-19.000.000,00 en este ejemplo) es lo que se muestra como "Saldo actual" en pantalla. Ya tiene sumados, una sola vez cada uno: el saldo de origen, todos los movimientos firmes, y la cartera pendiente (con su signo ya corregido a favor nuestro — el -800.000,00 del Renglón 2 es justamente lo que devuelve _cheques_en_cartera, no el monto crudo guardado en la base).</w:t>
+        <w:t xml:space="preserve">El "saldo_final" (-18.200.000,00 en este ejemplo) es lo que se muestra como "Saldo actual" en pantalla. Notá que da EXACTAMENTE lo mismo que si el cheque en cartera no existiera (-15.000.000,00 + -3.200.000,00 = -18.200.000,00): mientras sigue pendiente, su efecto neto es cero, porque el Renglón 1 lo suma (+800.000,00) y el Renglón 2 lo neutraliza (-800.000,00). El día que ese cheque se entregue o se efectivice, el Renglón 2 deja de neutralizarlo y el saldo pasa a -17.400.000,00 (el del Renglón 1, con la deuda real ya sin tapar).</w:t>
       </w:r>
     </w:p>
     <w:p>
@@ -2117,7 +2131,7 @@
               <w:spacing w:after="60"/>
             </w:pPr>
             <w:r>
-              <w:t xml:space="preserve">La cartera YA está sumada una vez adentro de ese saldo final (es exactamente el Renglón 2). Volver a tocarla después de leer ese número es operar sobre algo que el sistema ya resolvió — el resultado deja de representar la realidad, pase lo que pase con el signo que uses.</w:t>
+              <w:t xml:space="preserve">La cartera pendiente YA está sumada y neutralizada adentro de ese saldo final (el Renglón 1 la suma, el Renglón 2 la neutraliza). Volver a tocarla después de leer ese número es operar sobre algo que el sistema ya resolvió — el resultado deja de representar la realidad, pase lo que pase con el signo que uses.</w:t>
             </w:r>
           </w:p>
         </w:tc>
@@ -2137,7 +2151,7 @@
         <w:spacing w:after="120" w:before="260"/>
       </w:pPr>
       <w:r>
-        <w:t xml:space="preserve">8.1 — Si restás el monto de cartera tal cual está cargado (con su signo)</w:t>
+        <w:t xml:space="preserve">8.1 — Si restás el monto de cartera guardado en la base, tal cual (positivo)</w:t>
       </w:r>
     </w:p>
     <w:p>
@@ -2145,7 +2159,7 @@
         <w:spacing w:after="160"/>
       </w:pPr>
       <w:r>
-        <w:t xml:space="preserve">Siguiendo el ejemplo: saldo_final (-19.000.000,00) menos el monto de cartera (-800.000,00) da -19.000.000,00 − (−800.000,00) = -18.200.000,00. Ese resultado es EXACTAMENTE el saldo del Renglón 1 — es decir, deshiciste la suma de la cartera. No lograste "descontar la cartera de más": lograste borrarla del cálculo, como si esos cheques pendientes no existieran. Si tu intención era justamente esa (ver el saldo SIN contar la cartera todavía pendiente), no hacía falta restar nada: ese valor ya te lo da el sistema directamente en el Renglón 1, sin ningún cálculo extra.</w:t>
+        <w:t xml:space="preserve">Siguiendo el ejemplo: saldo_final (-18.200.000,00) menos el monto guardado (800.000,00) da -18.200.000,00 − 800.000,00 = -19.000.000,00. Acá hay una duplicación real: el cheque en cartera termina beneficiando el saldo DOS VECES en la misma dirección — una vez adentro del cálculo del sistema (el Renglón 2 ya lo neutraliza) y otra vez a mano, encima del resultado ya final, como si hubiera dos cheques pendientes en vez de uno. Es exactamente el mismo error que se corrigió el 29/09/2026 adentro del sistema (ver la sección 3.3) — hecho a mano, después, sobre un número que ya estaba bien.</w:t>
       </w:r>
     </w:p>
     <w:p>
@@ -2154,7 +2168,7 @@
         <w:spacing w:after="120" w:before="260"/>
       </w:pPr>
       <w:r>
-        <w:t xml:space="preserve">8.2 — Si restás el monto de cartera en positivo (su valor absoluto)</w:t>
+        <w:t xml:space="preserve">8.2 — Si restás el valor que devuelve _cheques_en_cartera (ya negativo)</w:t>
       </w:r>
     </w:p>
     <w:p>
@@ -2162,7 +2176,7 @@
         <w:spacing w:after="160"/>
       </w:pPr>
       <w:r>
-        <w:t xml:space="preserve">Acá sí hay una duplicación real: -19.000.000,00 − 800.000,00 = -19.800.000,00. La cartera terminó restándose DOS veces en la misma dirección — una vez adentro del cálculo del sistema (Renglón 2), y otra vez a mano encima del resultado ya final. El saldo mostrado queda mal por exactamente el doble del monto de la cartera.</w:t>
+        <w:t xml:space="preserve">Siguiendo el ejemplo: saldo_final (-18.200.000,00) menos (-800.000,00) da -18.200.000,00 − (−800.000,00) = -17.400.000,00. Ese resultado es EXACTAMENTE el saldo del Renglón 1 -- es decir, deshiciste la neutralización: el cheque en cartera pasa a contar como si YA fuera una deuda real (como si se hubiese entregado), cuando en realidad sigue pendiente.</w:t>
       </w:r>
     </w:p>
     <w:p>
@@ -2179,7 +2193,7 @@
         <w:spacing w:after="160"/>
       </w:pPr>
       <w:r>
-        <w:t xml:space="preserve">Si lo que buscás es un número que EXCLUYA la cartera pendiente (por ejemplo, para saber cuánto hay "asegurado" sin contar cheques que todavía no se cobraron), tomá directamente el saldo del Renglón 1 ("Movimientos") — es el mismo saldo final, pero de ANTES de sumarle la cartera. No hace falta (ni corresponde) restarle nada al saldo final: la cartera no se resta, se suma una sola vez, y ese paso ya está hecho.</w:t>
+        <w:t xml:space="preserve">El saldo_final ya representa correctamente la situación de hoy (cartera pendiente con efecto neto cero). Si lo que buscás es un número que muestre la cartera YA COMO DEUDA (por ejemplo, para proyectar qué pasaría el día que se entregue), tomá directamente el saldo del Renglón 1 ("Movimientos") -- es el mismo saldo final, pero sin la neutralización de la cartera todavía pendiente. No hace falta (ni corresponde) restarle nada al saldo final a mano.</w:t>
       </w:r>
     </w:p>
     <w:p>
@@ -2381,7 +2395,7 @@
                 <w:sz w:val="19"/>
                 <w:szCs w:val="19"/>
               </w:rPr>
-              <w:t xml:space="preserve">Todos los movimientos firmes de la caja (cualquier libro, sin diferido pendiente)</w:t>
+              <w:t xml:space="preserve">Todos los movimientos firmes de la caja (cualquier libro, sin diferido pendiente), cartera pendiente incluida</w:t>
             </w:r>
           </w:p>
         </w:tc>
@@ -2403,7 +2417,7 @@
                 <w:sz w:val="19"/>
                 <w:szCs w:val="19"/>
               </w:rPr>
-              <w:t xml:space="preserve">_movimientos_firmes_excluyendo_cartera</w:t>
+              <w:t xml:space="preserve">_total_movimientos_firmes</w:t>
             </w:r>
           </w:p>
         </w:tc>
@@ -2423,7 +2437,7 @@
                 <w:sz w:val="19"/>
                 <w:szCs w:val="19"/>
               </w:rPr>
-              <w:t xml:space="preserve">Igual a la anterior, pero sin contar los cheques en cartera (para no duplicarlos)</w:t>
+              <w:t xml:space="preserve">Suma lo anterior (ya NO descarta los cheques en cartera desde el 29/09/2026)</w:t>
             </w:r>
           </w:p>
         </w:tc>
@@ -2465,7 +2479,7 @@
                 <w:sz w:val="19"/>
                 <w:szCs w:val="19"/>
               </w:rPr>
-              <w:t xml:space="preserve">Cheques para entregar a un productor, todavía sin entregar; el segundo ya devuelve el total con el signo a favor nuestro</w:t>
+              <w:t xml:space="preserve">Cheques para entregar a un productor, todavía sin entregar; el segundo devuelve la corrección (negativa) que neutraliza lo ya sumado arriba</w:t>
             </w:r>
           </w:p>
         </w:tc>

</xml_diff>